<commit_message>
new implementaton without conversiona
</commit_message>
<xml_diff>
--- a/Intellima ser manual 2024 August.docx
+++ b/Intellima ser manual 2024 August.docx
@@ -41,6 +41,7 @@
       <w:pPr>
         <w:pStyle w:val="Heading2"/>
         <w:spacing w:before="40" w:after="283"/>
+        <w:ind w:left="0" w:hanging="0"/>
         <w:rPr>
           <w:color w:val="111111"/>
         </w:rPr>
@@ -328,6 +329,7 @@
       <w:pPr>
         <w:pStyle w:val="Heading2"/>
         <w:spacing w:before="40" w:after="283"/>
+        <w:ind w:left="0" w:hanging="0"/>
         <w:rPr/>
       </w:pPr>
       <w:r>
@@ -518,6 +520,7 @@
       <w:pPr>
         <w:pStyle w:val="Heading2"/>
         <w:spacing w:before="40" w:after="283"/>
+        <w:ind w:left="0" w:hanging="0"/>
         <w:rPr/>
       </w:pPr>
       <w:r>
@@ -562,7 +565,7 @@
       </w:pPr>
       <w:r>
         <w:drawing>
-          <wp:anchor behindDoc="0" distT="0" distB="0" distL="0" distR="0" simplePos="0" locked="0" layoutInCell="0" allowOverlap="1" relativeHeight="5">
+          <wp:anchor behindDoc="0" distT="0" distB="0" distL="0" distR="0" simplePos="0" locked="0" layoutInCell="0" allowOverlap="1" relativeHeight="44">
             <wp:simplePos x="0" y="0"/>
             <wp:positionH relativeFrom="column">
               <wp:posOffset>1905</wp:posOffset>
@@ -656,7 +659,7 @@
           <w:numId w:val="0"/>
         </w:numPr>
         <w:spacing w:before="0" w:after="0"/>
-        <w:ind w:hanging="0"/>
+        <w:ind w:left="0" w:hanging="0"/>
         <w:rPr/>
       </w:pPr>
       <w:r>
@@ -691,7 +694,7 @@
           <w:numId w:val="0"/>
         </w:numPr>
         <w:spacing w:before="0" w:after="0"/>
-        <w:ind w:hanging="0"/>
+        <w:ind w:left="0" w:hanging="0"/>
         <w:rPr/>
       </w:pPr>
       <w:r>
@@ -724,7 +727,7 @@
           <w:ilvl w:val="0"/>
           <w:numId w:val="0"/>
         </w:numPr>
-        <w:ind w:hanging="0"/>
+        <w:ind w:left="0" w:hanging="0"/>
         <w:rPr/>
       </w:pPr>
       <w:r>
@@ -763,7 +766,7 @@
       </w:pPr>
       <w:r>
         <w:drawing>
-          <wp:anchor behindDoc="0" distT="0" distB="0" distL="0" distR="0" simplePos="0" locked="0" layoutInCell="0" allowOverlap="1" relativeHeight="6">
+          <wp:anchor behindDoc="0" distT="0" distB="0" distL="0" distR="0" simplePos="0" locked="0" layoutInCell="0" allowOverlap="1" relativeHeight="45">
             <wp:simplePos x="0" y="0"/>
             <wp:positionH relativeFrom="column">
               <wp:posOffset>49530</wp:posOffset>
@@ -1023,7 +1026,7 @@
           <w:numId w:val="0"/>
         </w:numPr>
         <w:spacing w:before="0" w:after="0"/>
-        <w:ind w:hanging="0"/>
+        <w:ind w:left="0" w:hanging="0"/>
         <w:rPr/>
       </w:pPr>
       <w:r>
@@ -1038,13 +1041,13 @@
           <w:numId w:val="0"/>
         </w:numPr>
         <w:spacing w:before="0" w:after="0"/>
-        <w:ind w:hanging="0"/>
+        <w:ind w:left="0" w:hanging="0"/>
         <w:rPr/>
       </w:pPr>
       <w:r>
         <w:rPr/>
         <w:drawing>
-          <wp:anchor behindDoc="0" distT="0" distB="0" distL="0" distR="0" simplePos="0" locked="0" layoutInCell="0" allowOverlap="1" relativeHeight="7">
+          <wp:anchor behindDoc="0" distT="0" distB="0" distL="0" distR="0" simplePos="0" locked="0" layoutInCell="0" allowOverlap="1" relativeHeight="46">
             <wp:simplePos x="0" y="0"/>
             <wp:positionH relativeFrom="column">
               <wp:align>center</wp:align>
@@ -1098,7 +1101,7 @@
           <w:numId w:val="0"/>
         </w:numPr>
         <w:spacing w:before="0" w:after="0"/>
-        <w:ind w:hanging="0"/>
+        <w:ind w:left="0" w:hanging="0"/>
         <w:rPr/>
       </w:pPr>
       <w:r>
@@ -1113,7 +1116,7 @@
           <w:numId w:val="0"/>
         </w:numPr>
         <w:spacing w:before="0" w:after="0"/>
-        <w:ind w:hanging="0"/>
+        <w:ind w:left="0" w:hanging="0"/>
         <w:rPr/>
       </w:pPr>
       <w:r>
@@ -1128,9 +1131,8 @@
         <w:rPr/>
       </w:pPr>
       <w:r>
-        <w:rPr/>
         <w:drawing>
-          <wp:anchor behindDoc="0" distT="0" distB="0" distL="0" distR="0" simplePos="0" locked="0" layoutInCell="0" allowOverlap="1" relativeHeight="8">
+          <wp:anchor behindDoc="0" distT="0" distB="0" distL="0" distR="0" simplePos="0" locked="0" layoutInCell="0" allowOverlap="1" relativeHeight="47">
             <wp:simplePos x="0" y="0"/>
             <wp:positionH relativeFrom="column">
               <wp:posOffset>869950</wp:posOffset>
@@ -1199,7 +1201,7 @@
           <w:numId w:val="0"/>
         </w:numPr>
         <w:spacing w:before="0" w:after="0"/>
-        <w:ind w:hanging="0"/>
+        <w:ind w:left="0" w:hanging="0"/>
         <w:rPr/>
       </w:pPr>
       <w:r>
@@ -1214,7 +1216,7 @@
           <w:numId w:val="0"/>
         </w:numPr>
         <w:spacing w:before="0" w:after="0"/>
-        <w:ind w:hanging="0"/>
+        <w:ind w:left="0" w:hanging="0"/>
         <w:rPr/>
       </w:pPr>
       <w:r>
@@ -1230,7 +1232,7 @@
           <w:numId w:val="0"/>
         </w:numPr>
         <w:spacing w:before="0" w:after="0"/>
-        <w:ind w:hanging="0"/>
+        <w:ind w:left="0" w:hanging="0"/>
         <w:rPr/>
       </w:pPr>
       <w:r>
@@ -1254,11 +1256,7 @@
       </w:pPr>
       <w:r>
         <w:rPr/>
-        <w:t xml:space="preserve">Buyer </w:t>
-      </w:r>
-      <w:r>
-        <w:rPr/>
-        <w:t>receives an email with the new quotation and PDF.</w:t>
+        <w:t>Buyer receives an email with the new quotation and PDF.</w:t>
       </w:r>
     </w:p>
     <w:p>
@@ -1290,7 +1288,7 @@
       <w:r>
         <w:rPr/>
         <w:drawing>
-          <wp:anchor behindDoc="0" distT="0" distB="0" distL="0" distR="0" simplePos="0" locked="0" layoutInCell="0" allowOverlap="1" relativeHeight="31">
+          <wp:anchor behindDoc="0" distT="0" distB="0" distL="0" distR="0" simplePos="0" locked="0" layoutInCell="0" allowOverlap="1" relativeHeight="71">
             <wp:simplePos x="0" y="0"/>
             <wp:positionH relativeFrom="column">
               <wp:posOffset>153670</wp:posOffset>
@@ -1344,7 +1342,7 @@
           <w:numId w:val="0"/>
         </w:numPr>
         <w:spacing w:before="0" w:after="0"/>
-        <w:ind w:hanging="0"/>
+        <w:ind w:left="0" w:hanging="0"/>
         <w:rPr/>
       </w:pPr>
       <w:r>
@@ -1532,7 +1530,7 @@
           <w:numId w:val="0"/>
         </w:numPr>
         <w:spacing w:before="0" w:after="0"/>
-        <w:ind w:hanging="0"/>
+        <w:ind w:left="0" w:hanging="0"/>
         <w:rPr/>
       </w:pPr>
       <w:r>
@@ -1597,12 +1595,10 @@
       </w:pPr>
       <w:r>
         <w:rPr/>
-      </w:r>
-      <w:r>
         <mc:AlternateContent>
           <mc:Choice Requires="wps">
             <w:drawing>
-              <wp:anchor behindDoc="0" distT="72390" distB="72390" distL="72390" distR="72390" simplePos="0" locked="0" layoutInCell="0" allowOverlap="1" relativeHeight="9">
+              <wp:anchor behindDoc="0" distT="71755" distB="71755" distL="71120" distR="72390" simplePos="0" locked="0" layoutInCell="0" allowOverlap="1" relativeHeight="48">
                 <wp:simplePos x="0" y="0"/>
                 <wp:positionH relativeFrom="column">
                   <wp:posOffset>371475</wp:posOffset>
@@ -1611,28 +1607,37 @@
                   <wp:posOffset>46990</wp:posOffset>
                 </wp:positionV>
                 <wp:extent cx="6058535" cy="3014980"/>
-                <wp:effectExtent l="0" t="0" r="0" b="0"/>
+                <wp:effectExtent l="1270" t="635" r="0" b="635"/>
                 <wp:wrapSquare wrapText="bothSides"/>
                 <wp:docPr id="6" name="Frame2"/>
                 <a:graphic xmlns:a="http://schemas.openxmlformats.org/drawingml/2006/main">
                   <a:graphicData uri="http://schemas.microsoft.com/office/word/2010/wordprocessingShape">
                     <wps:wsp>
-                      <wps:cNvSpPr txBox="1"/>
+                      <wps:cNvSpPr/>
                       <wps:spPr>
                         <a:xfrm>
                           <a:off x="0" y="0"/>
-                          <a:ext cx="6058535" cy="3014980"/>
+                          <a:ext cx="6058440" cy="3015000"/>
                         </a:xfrm>
-                        <a:prstGeom prst="rect"/>
+                        <a:prstGeom prst="rect">
+                          <a:avLst/>
+                        </a:prstGeom>
                         <a:solidFill>
-                          <a:srgbClr val="FFFFFF"/>
+                          <a:srgbClr val="ffffff"/>
                         </a:solidFill>
                         <a:ln w="635">
                           <a:solidFill>
                             <a:srgbClr val="000000"/>
                           </a:solidFill>
+                          <a:round/>
                         </a:ln>
                       </wps:spPr>
+                      <wps:style>
+                        <a:lnRef idx="0"/>
+                        <a:fillRef idx="0"/>
+                        <a:effectRef idx="0"/>
+                        <a:fontRef idx="minor"/>
+                      </wps:style>
                       <wps:txbx>
                         <w:txbxContent>
                           <w:p>
@@ -1647,7 +1652,7 @@
                                 <wp:inline distT="0" distB="0" distL="0" distR="0">
                                   <wp:extent cx="5949315" cy="2510790"/>
                                   <wp:effectExtent l="0" t="0" r="0" b="0"/>
-                                  <wp:docPr id="7" name="Image6" descr=""/>
+                                  <wp:docPr id="8" name="Image6" descr=""/>
                                   <wp:cNvGraphicFramePr>
                                     <a:graphicFrameLocks xmlns:a="http://schemas.openxmlformats.org/drawingml/2006/main" noChangeAspect="1"/>
                                   </wp:cNvGraphicFramePr>
@@ -1655,7 +1660,7 @@
                                     <a:graphicData uri="http://schemas.openxmlformats.org/drawingml/2006/picture">
                                       <pic:pic xmlns:pic="http://schemas.openxmlformats.org/drawingml/2006/picture">
                                         <pic:nvPicPr>
-                                          <pic:cNvPr id="7" name="Image6" descr=""/>
+                                          <pic:cNvPr id="8" name="Image6" descr=""/>
                                           <pic:cNvPicPr>
                                             <a:picLocks noChangeAspect="1" noChangeArrowheads="1"/>
                                           </pic:cNvPicPr>
@@ -1684,7 +1689,7 @@
                           </w:p>
                         </w:txbxContent>
                       </wps:txbx>
-                      <wps:bodyPr anchor="t" lIns="53975" tIns="53975" rIns="53975" bIns="53975">
+                      <wps:bodyPr lIns="54000" rIns="54000" tIns="54000" bIns="54000" anchor="t">
                         <a:noAutofit/>
                       </wps:bodyPr>
                     </wps:wsp>
@@ -1695,8 +1700,10 @@
           </mc:Choice>
           <mc:Fallback>
             <w:pict>
-              <v:rect strokecolor="#000000" strokeweight="0pt" style="position:absolute;rotation:-0;width:477.05pt;height:237.4pt;mso-wrap-distance-left:5.7pt;mso-wrap-distance-right:5.7pt;mso-wrap-distance-top:5.7pt;mso-wrap-distance-bottom:5.7pt;margin-top:3.7pt;mso-position-vertical-relative:text;margin-left:29.25pt;mso-position-horizontal-relative:text">
-                <v:textbox inset="0.0590277777777778in,0.0590277777777778in,0.0590277777777778in,0.0590277777777778in">
+              <v:rect id="shape_0" ID="Frame2" path="m0,0l-2147483645,0l-2147483645,-2147483646l0,-2147483646xe" fillcolor="white" stroked="t" o:allowincell="f" style="position:absolute;margin-left:29.25pt;margin-top:3.7pt;width:477pt;height:237.35pt;mso-wrap-style:none;v-text-anchor:middle">
+                <v:fill o:detectmouseclick="t" type="solid" color2="black"/>
+                <v:stroke color="black" weight="720" joinstyle="round" endcap="flat"/>
+                <v:textbox>
                   <w:txbxContent>
                     <w:p>
                       <w:pPr>
@@ -1710,7 +1717,7 @@
                           <wp:inline distT="0" distB="0" distL="0" distR="0">
                             <wp:extent cx="5949315" cy="2510790"/>
                             <wp:effectExtent l="0" t="0" r="0" b="0"/>
-                            <wp:docPr id="8" name="Image6" descr=""/>
+                            <wp:docPr id="9" name="Image6" descr=""/>
                             <wp:cNvGraphicFramePr>
                               <a:graphicFrameLocks xmlns:a="http://schemas.openxmlformats.org/drawingml/2006/main" noChangeAspect="1"/>
                             </wp:cNvGraphicFramePr>
@@ -1718,7 +1725,7 @@
                               <a:graphicData uri="http://schemas.openxmlformats.org/drawingml/2006/picture">
                                 <pic:pic xmlns:pic="http://schemas.openxmlformats.org/drawingml/2006/picture">
                                   <pic:nvPicPr>
-                                    <pic:cNvPr id="8" name="Image6" descr=""/>
+                                    <pic:cNvPr id="9" name="Image6" descr=""/>
                                     <pic:cNvPicPr>
                                       <a:picLocks noChangeAspect="1" noChangeArrowheads="1"/>
                                     </pic:cNvPicPr>
@@ -1772,7 +1779,7 @@
           <w:numId w:val="0"/>
         </w:numPr>
         <w:spacing w:before="0" w:after="0"/>
-        <w:ind w:hanging="0"/>
+        <w:ind w:left="0" w:hanging="0"/>
         <w:rPr/>
       </w:pPr>
       <w:r>
@@ -1808,7 +1815,7 @@
           <w:numId w:val="0"/>
         </w:numPr>
         <w:spacing w:before="0" w:after="0"/>
-        <w:ind w:hanging="0"/>
+        <w:ind w:left="0" w:hanging="0"/>
         <w:rPr/>
       </w:pPr>
       <w:r>
@@ -1832,11 +1839,7 @@
       </w:pPr>
       <w:r>
         <w:rPr/>
-        <w:t xml:space="preserve">Clause 93B: Weight in kilograms </w:t>
-      </w:r>
-      <w:r>
-        <w:rPr/>
-        <w:t>and Delivery date</w:t>
+        <w:t>Clause 93B: Weight in kilograms and Delivery date</w:t>
       </w:r>
     </w:p>
     <w:p>
@@ -1887,7 +1890,7 @@
       </w:pPr>
       <w:r>
         <w:drawing>
-          <wp:anchor behindDoc="0" distT="0" distB="0" distL="0" distR="0" simplePos="0" locked="0" layoutInCell="0" allowOverlap="1" relativeHeight="11">
+          <wp:anchor behindDoc="0" distT="0" distB="0" distL="0" distR="0" simplePos="0" locked="0" layoutInCell="0" allowOverlap="1" relativeHeight="50">
             <wp:simplePos x="0" y="0"/>
             <wp:positionH relativeFrom="column">
               <wp:posOffset>9525</wp:posOffset>
@@ -1898,7 +1901,7 @@
             <wp:extent cx="5943600" cy="2860040"/>
             <wp:effectExtent l="0" t="0" r="0" b="0"/>
             <wp:wrapSquare wrapText="largest"/>
-            <wp:docPr id="9" name="Image7" descr=""/>
+            <wp:docPr id="10" name="Image7" descr=""/>
             <wp:cNvGraphicFramePr>
               <a:graphicFrameLocks xmlns:a="http://schemas.openxmlformats.org/drawingml/2006/main" noChangeAspect="1"/>
             </wp:cNvGraphicFramePr>
@@ -1906,7 +1909,7 @@
               <a:graphicData uri="http://schemas.openxmlformats.org/drawingml/2006/picture">
                 <pic:pic xmlns:pic="http://schemas.openxmlformats.org/drawingml/2006/picture">
                   <pic:nvPicPr>
-                    <pic:cNvPr id="9" name="Image7" descr=""/>
+                    <pic:cNvPr id="10" name="Image7" descr=""/>
                     <pic:cNvPicPr>
                       <a:picLocks noChangeAspect="1" noChangeArrowheads="1"/>
                     </pic:cNvPicPr>
@@ -1986,7 +1989,7 @@
       <w:r>
         <w:rPr/>
         <w:drawing>
-          <wp:anchor behindDoc="0" distT="0" distB="0" distL="0" distR="0" simplePos="0" locked="0" layoutInCell="0" allowOverlap="1" relativeHeight="12">
+          <wp:anchor behindDoc="0" distT="0" distB="0" distL="0" distR="0" simplePos="0" locked="0" layoutInCell="0" allowOverlap="1" relativeHeight="51">
             <wp:simplePos x="0" y="0"/>
             <wp:positionH relativeFrom="column">
               <wp:posOffset>-428625</wp:posOffset>
@@ -1997,7 +2000,7 @@
             <wp:extent cx="6849110" cy="2586355"/>
             <wp:effectExtent l="0" t="0" r="0" b="0"/>
             <wp:wrapSquare wrapText="largest"/>
-            <wp:docPr id="10" name="Image8" descr=""/>
+            <wp:docPr id="11" name="Image8" descr=""/>
             <wp:cNvGraphicFramePr>
               <a:graphicFrameLocks xmlns:a="http://schemas.openxmlformats.org/drawingml/2006/main" noChangeAspect="1"/>
             </wp:cNvGraphicFramePr>
@@ -2005,7 +2008,7 @@
               <a:graphicData uri="http://schemas.openxmlformats.org/drawingml/2006/picture">
                 <pic:pic xmlns:pic="http://schemas.openxmlformats.org/drawingml/2006/picture">
                   <pic:nvPicPr>
-                    <pic:cNvPr id="10" name="Image8" descr=""/>
+                    <pic:cNvPr id="11" name="Image8" descr=""/>
                     <pic:cNvPicPr>
                       <a:picLocks noChangeAspect="1" noChangeArrowheads="1"/>
                     </pic:cNvPicPr>
@@ -2073,6 +2076,7 @@
       <w:pPr>
         <w:pStyle w:val="Heading2"/>
         <w:spacing w:before="40" w:after="283"/>
+        <w:ind w:left="0" w:hanging="0"/>
         <w:rPr/>
       </w:pPr>
       <w:r>
@@ -2128,7 +2132,7 @@
           <w:numId w:val="0"/>
         </w:numPr>
         <w:spacing w:before="0" w:after="0"/>
-        <w:ind w:hanging="0"/>
+        <w:ind w:left="0" w:hanging="0"/>
         <w:rPr/>
       </w:pPr>
       <w:r>
@@ -2152,11 +2156,7 @@
       </w:pPr>
       <w:r>
         <w:rPr/>
-        <w:t xml:space="preserve">Fills in the supply form based on capacity. </w:t>
-      </w:r>
-      <w:r>
-        <w:rPr/>
-        <w:t xml:space="preserve">If they fill in more quantity than needed they get an error </w:t>
+        <w:t xml:space="preserve">Fills in the supply form based on capacity. If they fill in more quantity than needed they get an error </w:t>
       </w:r>
     </w:p>
     <w:p>
@@ -2178,7 +2178,7 @@
       <w:r>
         <w:rPr/>
         <w:drawing>
-          <wp:anchor behindDoc="0" distT="0" distB="0" distL="0" distR="0" simplePos="0" locked="0" layoutInCell="0" allowOverlap="1" relativeHeight="13">
+          <wp:anchor behindDoc="0" distT="0" distB="0" distL="0" distR="0" simplePos="0" locked="0" layoutInCell="0" allowOverlap="1" relativeHeight="52">
             <wp:simplePos x="0" y="0"/>
             <wp:positionH relativeFrom="column">
               <wp:align>center</wp:align>
@@ -2189,7 +2189,7 @@
             <wp:extent cx="5181600" cy="4330700"/>
             <wp:effectExtent l="0" t="0" r="0" b="0"/>
             <wp:wrapSquare wrapText="largest"/>
-            <wp:docPr id="11" name="Image9" descr=""/>
+            <wp:docPr id="12" name="Image9" descr=""/>
             <wp:cNvGraphicFramePr>
               <a:graphicFrameLocks xmlns:a="http://schemas.openxmlformats.org/drawingml/2006/main" noChangeAspect="1"/>
             </wp:cNvGraphicFramePr>
@@ -2197,7 +2197,7 @@
               <a:graphicData uri="http://schemas.openxmlformats.org/drawingml/2006/picture">
                 <pic:pic xmlns:pic="http://schemas.openxmlformats.org/drawingml/2006/picture">
                   <pic:nvPicPr>
-                    <pic:cNvPr id="11" name="Image9" descr=""/>
+                    <pic:cNvPr id="12" name="Image9" descr=""/>
                     <pic:cNvPicPr>
                       <a:picLocks noChangeAspect="1" noChangeArrowheads="1"/>
                     </pic:cNvPicPr>
@@ -2242,7 +2242,7 @@
           <w:numId w:val="0"/>
         </w:numPr>
         <w:spacing w:before="0" w:after="0"/>
-        <w:ind w:hanging="0"/>
+        <w:ind w:left="0" w:hanging="0"/>
         <w:rPr/>
       </w:pPr>
       <w:r>
@@ -2285,7 +2285,7 @@
       <w:r>
         <w:rPr/>
         <w:drawing>
-          <wp:anchor behindDoc="0" distT="0" distB="0" distL="0" distR="0" simplePos="0" locked="0" layoutInCell="0" allowOverlap="1" relativeHeight="14">
+          <wp:anchor behindDoc="0" distT="0" distB="0" distL="0" distR="0" simplePos="0" locked="0" layoutInCell="0" allowOverlap="1" relativeHeight="53">
             <wp:simplePos x="0" y="0"/>
             <wp:positionH relativeFrom="column">
               <wp:align>center</wp:align>
@@ -2296,7 +2296,7 @@
             <wp:extent cx="5943600" cy="2834005"/>
             <wp:effectExtent l="0" t="0" r="0" b="0"/>
             <wp:wrapSquare wrapText="largest"/>
-            <wp:docPr id="12" name="Image10" descr=""/>
+            <wp:docPr id="13" name="Image10" descr=""/>
             <wp:cNvGraphicFramePr>
               <a:graphicFrameLocks xmlns:a="http://schemas.openxmlformats.org/drawingml/2006/main" noChangeAspect="1"/>
             </wp:cNvGraphicFramePr>
@@ -2304,7 +2304,7 @@
               <a:graphicData uri="http://schemas.openxmlformats.org/drawingml/2006/picture">
                 <pic:pic xmlns:pic="http://schemas.openxmlformats.org/drawingml/2006/picture">
                   <pic:nvPicPr>
-                    <pic:cNvPr id="12" name="Image10" descr=""/>
+                    <pic:cNvPr id="13" name="Image10" descr=""/>
                     <pic:cNvPicPr>
                       <a:picLocks noChangeAspect="1" noChangeArrowheads="1"/>
                     </pic:cNvPicPr>
@@ -2344,6 +2344,7 @@
       <w:pPr>
         <w:pStyle w:val="Heading2"/>
         <w:spacing w:before="40" w:after="283"/>
+        <w:ind w:left="0" w:hanging="0"/>
         <w:rPr/>
       </w:pPr>
       <w:r>
@@ -2399,13 +2400,13 @@
           <w:numId w:val="0"/>
         </w:numPr>
         <w:spacing w:before="0" w:after="0"/>
-        <w:ind w:hanging="0"/>
+        <w:ind w:left="0" w:hanging="0"/>
         <w:rPr/>
       </w:pPr>
       <w:r>
         <w:rPr/>
         <w:drawing>
-          <wp:anchor behindDoc="0" distT="0" distB="0" distL="0" distR="0" simplePos="0" locked="0" layoutInCell="0" allowOverlap="1" relativeHeight="15">
+          <wp:anchor behindDoc="0" distT="0" distB="0" distL="0" distR="0" simplePos="0" locked="0" layoutInCell="0" allowOverlap="1" relativeHeight="54">
             <wp:simplePos x="0" y="0"/>
             <wp:positionH relativeFrom="column">
               <wp:align>center</wp:align>
@@ -2416,7 +2417,7 @@
             <wp:extent cx="5673090" cy="2571750"/>
             <wp:effectExtent l="0" t="0" r="0" b="0"/>
             <wp:wrapSquare wrapText="largest"/>
-            <wp:docPr id="13" name="Image11" descr=""/>
+            <wp:docPr id="14" name="Image11" descr=""/>
             <wp:cNvGraphicFramePr>
               <a:graphicFrameLocks xmlns:a="http://schemas.openxmlformats.org/drawingml/2006/main" noChangeAspect="1"/>
             </wp:cNvGraphicFramePr>
@@ -2424,7 +2425,7 @@
               <a:graphicData uri="http://schemas.openxmlformats.org/drawingml/2006/picture">
                 <pic:pic xmlns:pic="http://schemas.openxmlformats.org/drawingml/2006/picture">
                   <pic:nvPicPr>
-                    <pic:cNvPr id="13" name="Image11" descr=""/>
+                    <pic:cNvPr id="14" name="Image11" descr=""/>
                     <pic:cNvPicPr>
                       <a:picLocks noChangeAspect="1" noChangeArrowheads="1"/>
                     </pic:cNvPicPr>
@@ -2498,7 +2499,7 @@
       <w:r>
         <w:rPr/>
         <w:drawing>
-          <wp:anchor behindDoc="0" distT="0" distB="0" distL="0" distR="0" simplePos="0" locked="0" layoutInCell="0" allowOverlap="1" relativeHeight="21">
+          <wp:anchor behindDoc="0" distT="0" distB="0" distL="0" distR="0" simplePos="0" locked="0" layoutInCell="0" allowOverlap="1" relativeHeight="60">
             <wp:simplePos x="0" y="0"/>
             <wp:positionH relativeFrom="column">
               <wp:align>center</wp:align>
@@ -2509,7 +2510,7 @@
             <wp:extent cx="5943600" cy="2694305"/>
             <wp:effectExtent l="0" t="0" r="0" b="0"/>
             <wp:wrapSquare wrapText="largest"/>
-            <wp:docPr id="14" name="Image17" descr=""/>
+            <wp:docPr id="15" name="Image17" descr=""/>
             <wp:cNvGraphicFramePr>
               <a:graphicFrameLocks xmlns:a="http://schemas.openxmlformats.org/drawingml/2006/main" noChangeAspect="1"/>
             </wp:cNvGraphicFramePr>
@@ -2517,7 +2518,7 @@
               <a:graphicData uri="http://schemas.openxmlformats.org/drawingml/2006/picture">
                 <pic:pic xmlns:pic="http://schemas.openxmlformats.org/drawingml/2006/picture">
                   <pic:nvPicPr>
-                    <pic:cNvPr id="14" name="Image17" descr=""/>
+                    <pic:cNvPr id="15" name="Image17" descr=""/>
                     <pic:cNvPicPr>
                       <a:picLocks noChangeAspect="1" noChangeArrowheads="1"/>
                     </pic:cNvPicPr>
@@ -2566,6 +2567,7 @@
       <w:pPr>
         <w:pStyle w:val="Heading2"/>
         <w:spacing w:before="40" w:after="283"/>
+        <w:ind w:left="0" w:hanging="0"/>
         <w:rPr/>
       </w:pPr>
       <w:r>
@@ -2601,7 +2603,7 @@
       </w:pPr>
       <w:r>
         <w:drawing>
-          <wp:anchor behindDoc="0" distT="0" distB="0" distL="0" distR="0" simplePos="0" locked="0" layoutInCell="0" allowOverlap="1" relativeHeight="16">
+          <wp:anchor behindDoc="0" distT="0" distB="0" distL="0" distR="0" simplePos="0" locked="0" layoutInCell="0" allowOverlap="1" relativeHeight="55">
             <wp:simplePos x="0" y="0"/>
             <wp:positionH relativeFrom="column">
               <wp:posOffset>-338455</wp:posOffset>
@@ -2612,7 +2614,7 @@
             <wp:extent cx="6620510" cy="2834005"/>
             <wp:effectExtent l="0" t="0" r="0" b="0"/>
             <wp:wrapSquare wrapText="largest"/>
-            <wp:docPr id="15" name="Image12" descr=""/>
+            <wp:docPr id="16" name="Image12" descr=""/>
             <wp:cNvGraphicFramePr>
               <a:graphicFrameLocks xmlns:a="http://schemas.openxmlformats.org/drawingml/2006/main" noChangeAspect="1"/>
             </wp:cNvGraphicFramePr>
@@ -2620,7 +2622,7 @@
               <a:graphicData uri="http://schemas.openxmlformats.org/drawingml/2006/picture">
                 <pic:pic xmlns:pic="http://schemas.openxmlformats.org/drawingml/2006/picture">
                   <pic:nvPicPr>
-                    <pic:cNvPr id="15" name="Image12" descr=""/>
+                    <pic:cNvPr id="16" name="Image12" descr=""/>
                     <pic:cNvPicPr>
                       <a:picLocks noChangeAspect="1" noChangeArrowheads="1"/>
                     </pic:cNvPicPr>
@@ -2740,7 +2742,7 @@
       <w:r>
         <w:rPr/>
         <w:drawing>
-          <wp:anchor behindDoc="0" distT="0" distB="0" distL="0" distR="0" simplePos="0" locked="0" layoutInCell="0" allowOverlap="1" relativeHeight="22">
+          <wp:anchor behindDoc="0" distT="0" distB="0" distL="0" distR="0" simplePos="0" locked="0" layoutInCell="0" allowOverlap="1" relativeHeight="61">
             <wp:simplePos x="0" y="0"/>
             <wp:positionH relativeFrom="column">
               <wp:align>center</wp:align>
@@ -2751,7 +2753,7 @@
             <wp:extent cx="5943600" cy="2834005"/>
             <wp:effectExtent l="0" t="0" r="0" b="0"/>
             <wp:wrapSquare wrapText="largest"/>
-            <wp:docPr id="16" name="Image18" descr=""/>
+            <wp:docPr id="17" name="Image18" descr=""/>
             <wp:cNvGraphicFramePr>
               <a:graphicFrameLocks xmlns:a="http://schemas.openxmlformats.org/drawingml/2006/main" noChangeAspect="1"/>
             </wp:cNvGraphicFramePr>
@@ -2759,7 +2761,7 @@
               <a:graphicData uri="http://schemas.openxmlformats.org/drawingml/2006/picture">
                 <pic:pic xmlns:pic="http://schemas.openxmlformats.org/drawingml/2006/picture">
                   <pic:nvPicPr>
-                    <pic:cNvPr id="16" name="Image18" descr=""/>
+                    <pic:cNvPr id="17" name="Image18" descr=""/>
                     <pic:cNvPicPr>
                       <a:picLocks noChangeAspect="1" noChangeArrowheads="1"/>
                     </pic:cNvPicPr>
@@ -2844,7 +2846,7 @@
       </w:pPr>
       <w:r>
         <w:drawing>
-          <wp:anchor behindDoc="0" distT="0" distB="0" distL="0" distR="0" simplePos="0" locked="0" layoutInCell="0" allowOverlap="1" relativeHeight="17">
+          <wp:anchor behindDoc="0" distT="0" distB="0" distL="0" distR="0" simplePos="0" locked="0" layoutInCell="0" allowOverlap="1" relativeHeight="56">
             <wp:simplePos x="0" y="0"/>
             <wp:positionH relativeFrom="column">
               <wp:posOffset>-462280</wp:posOffset>
@@ -2855,7 +2857,7 @@
             <wp:extent cx="6687185" cy="2946400"/>
             <wp:effectExtent l="0" t="0" r="0" b="0"/>
             <wp:wrapSquare wrapText="largest"/>
-            <wp:docPr id="17" name="Image13" descr=""/>
+            <wp:docPr id="18" name="Image13" descr=""/>
             <wp:cNvGraphicFramePr>
               <a:graphicFrameLocks xmlns:a="http://schemas.openxmlformats.org/drawingml/2006/main" noChangeAspect="1"/>
             </wp:cNvGraphicFramePr>
@@ -2863,7 +2865,7 @@
               <a:graphicData uri="http://schemas.openxmlformats.org/drawingml/2006/picture">
                 <pic:pic xmlns:pic="http://schemas.openxmlformats.org/drawingml/2006/picture">
                   <pic:nvPicPr>
-                    <pic:cNvPr id="17" name="Image13" descr=""/>
+                    <pic:cNvPr id="18" name="Image13" descr=""/>
                     <pic:cNvPicPr>
                       <a:picLocks noChangeAspect="1" noChangeArrowheads="1"/>
                     </pic:cNvPicPr>
@@ -2951,7 +2953,7 @@
       <w:r>
         <w:rPr/>
         <w:drawing>
-          <wp:anchor behindDoc="0" distT="0" distB="0" distL="0" distR="0" simplePos="0" locked="0" layoutInCell="0" allowOverlap="1" relativeHeight="18">
+          <wp:anchor behindDoc="0" distT="0" distB="0" distL="0" distR="0" simplePos="0" locked="0" layoutInCell="0" allowOverlap="1" relativeHeight="57">
             <wp:simplePos x="0" y="0"/>
             <wp:positionH relativeFrom="column">
               <wp:align>center</wp:align>
@@ -2962,7 +2964,7 @@
             <wp:extent cx="5943600" cy="2834005"/>
             <wp:effectExtent l="0" t="0" r="0" b="0"/>
             <wp:wrapSquare wrapText="largest"/>
-            <wp:docPr id="18" name="Image14" descr=""/>
+            <wp:docPr id="19" name="Image14" descr=""/>
             <wp:cNvGraphicFramePr>
               <a:graphicFrameLocks xmlns:a="http://schemas.openxmlformats.org/drawingml/2006/main" noChangeAspect="1"/>
             </wp:cNvGraphicFramePr>
@@ -2970,7 +2972,7 @@
               <a:graphicData uri="http://schemas.openxmlformats.org/drawingml/2006/picture">
                 <pic:pic xmlns:pic="http://schemas.openxmlformats.org/drawingml/2006/picture">
                   <pic:nvPicPr>
-                    <pic:cNvPr id="18" name="Image14" descr=""/>
+                    <pic:cNvPr id="19" name="Image14" descr=""/>
                     <pic:cNvPicPr>
                       <a:picLocks noChangeAspect="1" noChangeArrowheads="1"/>
                     </pic:cNvPicPr>
@@ -3001,6 +3003,7 @@
       <w:pPr>
         <w:pStyle w:val="Heading2"/>
         <w:spacing w:before="40" w:after="283"/>
+        <w:ind w:left="0" w:hanging="0"/>
         <w:rPr/>
       </w:pPr>
       <w:r>
@@ -3078,7 +3081,7 @@
       <w:r>
         <w:rPr/>
         <w:drawing>
-          <wp:anchor behindDoc="0" distT="0" distB="0" distL="0" distR="0" simplePos="0" locked="0" layoutInCell="0" allowOverlap="1" relativeHeight="19">
+          <wp:anchor behindDoc="0" distT="0" distB="0" distL="0" distR="0" simplePos="0" locked="0" layoutInCell="0" allowOverlap="1" relativeHeight="58">
             <wp:simplePos x="0" y="0"/>
             <wp:positionH relativeFrom="column">
               <wp:align>center</wp:align>
@@ -3089,7 +3092,7 @@
             <wp:extent cx="5943600" cy="2834005"/>
             <wp:effectExtent l="0" t="0" r="0" b="0"/>
             <wp:wrapSquare wrapText="largest"/>
-            <wp:docPr id="19" name="Image15" descr=""/>
+            <wp:docPr id="20" name="Image15" descr=""/>
             <wp:cNvGraphicFramePr>
               <a:graphicFrameLocks xmlns:a="http://schemas.openxmlformats.org/drawingml/2006/main" noChangeAspect="1"/>
             </wp:cNvGraphicFramePr>
@@ -3097,7 +3100,7 @@
               <a:graphicData uri="http://schemas.openxmlformats.org/drawingml/2006/picture">
                 <pic:pic xmlns:pic="http://schemas.openxmlformats.org/drawingml/2006/picture">
                   <pic:nvPicPr>
-                    <pic:cNvPr id="19" name="Image15" descr=""/>
+                    <pic:cNvPr id="20" name="Image15" descr=""/>
                     <pic:cNvPicPr>
                       <a:picLocks noChangeAspect="1" noChangeArrowheads="1"/>
                     </pic:cNvPicPr>
@@ -3133,7 +3136,7 @@
       <w:r>
         <w:rPr/>
         <w:drawing>
-          <wp:anchor behindDoc="0" distT="0" distB="0" distL="0" distR="0" simplePos="0" locked="0" layoutInCell="0" allowOverlap="1" relativeHeight="20">
+          <wp:anchor behindDoc="0" distT="0" distB="0" distL="0" distR="0" simplePos="0" locked="0" layoutInCell="0" allowOverlap="1" relativeHeight="59">
             <wp:simplePos x="0" y="0"/>
             <wp:positionH relativeFrom="column">
               <wp:align>center</wp:align>
@@ -3144,7 +3147,7 @@
             <wp:extent cx="5943600" cy="2834005"/>
             <wp:effectExtent l="0" t="0" r="0" b="0"/>
             <wp:wrapSquare wrapText="largest"/>
-            <wp:docPr id="20" name="Image16" descr=""/>
+            <wp:docPr id="21" name="Image16" descr=""/>
             <wp:cNvGraphicFramePr>
               <a:graphicFrameLocks xmlns:a="http://schemas.openxmlformats.org/drawingml/2006/main" noChangeAspect="1"/>
             </wp:cNvGraphicFramePr>
@@ -3152,7 +3155,7 @@
               <a:graphicData uri="http://schemas.openxmlformats.org/drawingml/2006/picture">
                 <pic:pic xmlns:pic="http://schemas.openxmlformats.org/drawingml/2006/picture">
                   <pic:nvPicPr>
-                    <pic:cNvPr id="20" name="Image16" descr=""/>
+                    <pic:cNvPr id="21" name="Image16" descr=""/>
                     <pic:cNvPicPr>
                       <a:picLocks noChangeAspect="1" noChangeArrowheads="1"/>
                     </pic:cNvPicPr>
@@ -3192,6 +3195,7 @@
       <w:pPr>
         <w:pStyle w:val="Heading2"/>
         <w:spacing w:before="40" w:after="283"/>
+        <w:ind w:left="0" w:hanging="0"/>
         <w:rPr/>
       </w:pPr>
       <w:r>
@@ -3248,7 +3252,7 @@
       <w:r>
         <w:rPr/>
         <w:drawing>
-          <wp:anchor behindDoc="0" distT="0" distB="0" distL="0" distR="0" simplePos="0" locked="0" layoutInCell="0" allowOverlap="1" relativeHeight="23">
+          <wp:anchor behindDoc="0" distT="0" distB="0" distL="0" distR="0" simplePos="0" locked="0" layoutInCell="0" allowOverlap="1" relativeHeight="62">
             <wp:simplePos x="0" y="0"/>
             <wp:positionH relativeFrom="column">
               <wp:align>center</wp:align>
@@ -3259,7 +3263,7 @@
             <wp:extent cx="5943600" cy="2834005"/>
             <wp:effectExtent l="0" t="0" r="0" b="0"/>
             <wp:wrapSquare wrapText="largest"/>
-            <wp:docPr id="21" name="Image19" descr=""/>
+            <wp:docPr id="22" name="Image19" descr=""/>
             <wp:cNvGraphicFramePr>
               <a:graphicFrameLocks xmlns:a="http://schemas.openxmlformats.org/drawingml/2006/main" noChangeAspect="1"/>
             </wp:cNvGraphicFramePr>
@@ -3267,7 +3271,7 @@
               <a:graphicData uri="http://schemas.openxmlformats.org/drawingml/2006/picture">
                 <pic:pic xmlns:pic="http://schemas.openxmlformats.org/drawingml/2006/picture">
                   <pic:nvPicPr>
-                    <pic:cNvPr id="21" name="Image19" descr=""/>
+                    <pic:cNvPr id="22" name="Image19" descr=""/>
                     <pic:cNvPicPr>
                       <a:picLocks noChangeAspect="1" noChangeArrowheads="1"/>
                     </pic:cNvPicPr>
@@ -3323,7 +3327,7 @@
       <w:r>
         <w:rPr/>
         <w:drawing>
-          <wp:anchor behindDoc="0" distT="0" distB="0" distL="0" distR="0" simplePos="0" locked="0" layoutInCell="0" allowOverlap="1" relativeHeight="24">
+          <wp:anchor behindDoc="0" distT="0" distB="0" distL="0" distR="0" simplePos="0" locked="0" layoutInCell="0" allowOverlap="1" relativeHeight="63">
             <wp:simplePos x="0" y="0"/>
             <wp:positionH relativeFrom="column">
               <wp:align>center</wp:align>
@@ -3334,7 +3338,7 @@
             <wp:extent cx="5943600" cy="2829560"/>
             <wp:effectExtent l="0" t="0" r="0" b="0"/>
             <wp:wrapSquare wrapText="largest"/>
-            <wp:docPr id="22" name="Image20" descr=""/>
+            <wp:docPr id="23" name="Image20" descr=""/>
             <wp:cNvGraphicFramePr>
               <a:graphicFrameLocks xmlns:a="http://schemas.openxmlformats.org/drawingml/2006/main" noChangeAspect="1"/>
             </wp:cNvGraphicFramePr>
@@ -3342,7 +3346,7 @@
               <a:graphicData uri="http://schemas.openxmlformats.org/drawingml/2006/picture">
                 <pic:pic xmlns:pic="http://schemas.openxmlformats.org/drawingml/2006/picture">
                   <pic:nvPicPr>
-                    <pic:cNvPr id="22" name="Image20" descr=""/>
+                    <pic:cNvPr id="23" name="Image20" descr=""/>
                     <pic:cNvPicPr>
                       <a:picLocks noChangeAspect="1" noChangeArrowheads="1"/>
                     </pic:cNvPicPr>
@@ -3424,7 +3428,7 @@
       <w:r>
         <w:rPr/>
         <w:drawing>
-          <wp:anchor behindDoc="0" distT="0" distB="0" distL="0" distR="0" simplePos="0" locked="0" layoutInCell="0" allowOverlap="1" relativeHeight="25">
+          <wp:anchor behindDoc="0" distT="0" distB="0" distL="0" distR="0" simplePos="0" locked="0" layoutInCell="0" allowOverlap="1" relativeHeight="64">
             <wp:simplePos x="0" y="0"/>
             <wp:positionH relativeFrom="column">
               <wp:align>center</wp:align>
@@ -3435,7 +3439,7 @@
             <wp:extent cx="5943600" cy="2834005"/>
             <wp:effectExtent l="0" t="0" r="0" b="0"/>
             <wp:wrapSquare wrapText="largest"/>
-            <wp:docPr id="23" name="Image21" descr=""/>
+            <wp:docPr id="24" name="Image21" descr=""/>
             <wp:cNvGraphicFramePr>
               <a:graphicFrameLocks xmlns:a="http://schemas.openxmlformats.org/drawingml/2006/main" noChangeAspect="1"/>
             </wp:cNvGraphicFramePr>
@@ -3443,7 +3447,7 @@
               <a:graphicData uri="http://schemas.openxmlformats.org/drawingml/2006/picture">
                 <pic:pic xmlns:pic="http://schemas.openxmlformats.org/drawingml/2006/picture">
                   <pic:nvPicPr>
-                    <pic:cNvPr id="23" name="Image21" descr=""/>
+                    <pic:cNvPr id="24" name="Image21" descr=""/>
                     <pic:cNvPicPr>
                       <a:picLocks noChangeAspect="1" noChangeArrowheads="1"/>
                     </pic:cNvPicPr>
@@ -3469,7 +3473,7 @@
           </wp:anchor>
         </w:drawing>
         <w:drawing>
-          <wp:anchor behindDoc="0" distT="0" distB="0" distL="0" distR="0" simplePos="0" locked="0" layoutInCell="0" allowOverlap="1" relativeHeight="26">
+          <wp:anchor behindDoc="0" distT="0" distB="0" distL="0" distR="0" simplePos="0" locked="0" layoutInCell="0" allowOverlap="1" relativeHeight="65">
             <wp:simplePos x="0" y="0"/>
             <wp:positionH relativeFrom="column">
               <wp:align>center</wp:align>
@@ -3480,7 +3484,7 @@
             <wp:extent cx="5943600" cy="2834005"/>
             <wp:effectExtent l="0" t="0" r="0" b="0"/>
             <wp:wrapSquare wrapText="largest"/>
-            <wp:docPr id="24" name="Image22" descr=""/>
+            <wp:docPr id="25" name="Image22" descr=""/>
             <wp:cNvGraphicFramePr>
               <a:graphicFrameLocks xmlns:a="http://schemas.openxmlformats.org/drawingml/2006/main" noChangeAspect="1"/>
             </wp:cNvGraphicFramePr>
@@ -3488,7 +3492,7 @@
               <a:graphicData uri="http://schemas.openxmlformats.org/drawingml/2006/picture">
                 <pic:pic xmlns:pic="http://schemas.openxmlformats.org/drawingml/2006/picture">
                   <pic:nvPicPr>
-                    <pic:cNvPr id="24" name="Image22" descr=""/>
+                    <pic:cNvPr id="25" name="Image22" descr=""/>
                     <pic:cNvPicPr>
                       <a:picLocks noChangeAspect="1" noChangeArrowheads="1"/>
                     </pic:cNvPicPr>
@@ -3528,10 +3532,7 @@
       </w:pPr>
       <w:r>
         <w:rPr>
-          <w:rFonts w:cs="Tahoma" w:ascii="Tahoma" w:hAnsi="Tahoma"/>
-          <w:b/>
-          <w:sz w:val="24"/>
-          <w:szCs w:val="24"/>
+          <w:rFonts w:cs="Arial" w:ascii="Arial" w:hAnsi="Arial"/>
         </w:rPr>
       </w:r>
     </w:p>
@@ -3539,6 +3540,7 @@
       <w:pPr>
         <w:pStyle w:val="Heading2"/>
         <w:spacing w:before="40" w:after="283"/>
+        <w:ind w:left="0" w:hanging="0"/>
         <w:rPr/>
       </w:pPr>
       <w:r>
@@ -3586,7 +3588,7 @@
       <w:r>
         <w:rPr/>
         <w:drawing>
-          <wp:anchor behindDoc="0" distT="0" distB="0" distL="0" distR="0" simplePos="0" locked="0" layoutInCell="0" allowOverlap="1" relativeHeight="27">
+          <wp:anchor behindDoc="0" distT="0" distB="0" distL="0" distR="0" simplePos="0" locked="0" layoutInCell="0" allowOverlap="1" relativeHeight="66">
             <wp:simplePos x="0" y="0"/>
             <wp:positionH relativeFrom="column">
               <wp:align>center</wp:align>
@@ -3597,7 +3599,7 @@
             <wp:extent cx="5943600" cy="2877820"/>
             <wp:effectExtent l="0" t="0" r="0" b="0"/>
             <wp:wrapSquare wrapText="largest"/>
-            <wp:docPr id="25" name="Image23" descr=""/>
+            <wp:docPr id="26" name="Image23" descr=""/>
             <wp:cNvGraphicFramePr>
               <a:graphicFrameLocks xmlns:a="http://schemas.openxmlformats.org/drawingml/2006/main" noChangeAspect="1"/>
             </wp:cNvGraphicFramePr>
@@ -3605,7 +3607,7 @@
               <a:graphicData uri="http://schemas.openxmlformats.org/drawingml/2006/picture">
                 <pic:pic xmlns:pic="http://schemas.openxmlformats.org/drawingml/2006/picture">
                   <pic:nvPicPr>
-                    <pic:cNvPr id="25" name="Image23" descr=""/>
+                    <pic:cNvPr id="26" name="Image23" descr=""/>
                     <pic:cNvPicPr>
                       <a:picLocks noChangeAspect="1" noChangeArrowheads="1"/>
                     </pic:cNvPicPr>
@@ -3661,7 +3663,7 @@
       <w:r>
         <w:rPr/>
         <w:drawing>
-          <wp:anchor behindDoc="0" distT="0" distB="0" distL="0" distR="0" simplePos="0" locked="0" layoutInCell="0" allowOverlap="1" relativeHeight="28">
+          <wp:anchor behindDoc="0" distT="0" distB="0" distL="0" distR="0" simplePos="0" locked="0" layoutInCell="0" allowOverlap="1" relativeHeight="67">
             <wp:simplePos x="0" y="0"/>
             <wp:positionH relativeFrom="column">
               <wp:align>center</wp:align>
@@ -3672,7 +3674,7 @@
             <wp:extent cx="5943600" cy="2834005"/>
             <wp:effectExtent l="0" t="0" r="0" b="0"/>
             <wp:wrapSquare wrapText="largest"/>
-            <wp:docPr id="26" name="Image24" descr=""/>
+            <wp:docPr id="27" name="Image24" descr=""/>
             <wp:cNvGraphicFramePr>
               <a:graphicFrameLocks xmlns:a="http://schemas.openxmlformats.org/drawingml/2006/main" noChangeAspect="1"/>
             </wp:cNvGraphicFramePr>
@@ -3680,7 +3682,7 @@
               <a:graphicData uri="http://schemas.openxmlformats.org/drawingml/2006/picture">
                 <pic:pic xmlns:pic="http://schemas.openxmlformats.org/drawingml/2006/picture">
                   <pic:nvPicPr>
-                    <pic:cNvPr id="26" name="Image24" descr=""/>
+                    <pic:cNvPr id="27" name="Image24" descr=""/>
                     <pic:cNvPicPr>
                       <a:picLocks noChangeAspect="1" noChangeArrowheads="1"/>
                     </pic:cNvPicPr>
@@ -3773,7 +3775,7 @@
       <w:r>
         <w:rPr/>
         <w:drawing>
-          <wp:anchor behindDoc="0" distT="0" distB="0" distL="0" distR="0" simplePos="0" locked="0" layoutInCell="0" allowOverlap="1" relativeHeight="29">
+          <wp:anchor behindDoc="0" distT="0" distB="0" distL="0" distR="0" simplePos="0" locked="0" layoutInCell="0" allowOverlap="1" relativeHeight="68">
             <wp:simplePos x="0" y="0"/>
             <wp:positionH relativeFrom="column">
               <wp:align>center</wp:align>
@@ -3784,7 +3786,7 @@
             <wp:extent cx="5943600" cy="2834005"/>
             <wp:effectExtent l="0" t="0" r="0" b="0"/>
             <wp:wrapSquare wrapText="largest"/>
-            <wp:docPr id="27" name="Image25" descr=""/>
+            <wp:docPr id="28" name="Image25" descr=""/>
             <wp:cNvGraphicFramePr>
               <a:graphicFrameLocks xmlns:a="http://schemas.openxmlformats.org/drawingml/2006/main" noChangeAspect="1"/>
             </wp:cNvGraphicFramePr>
@@ -3792,7 +3794,7 @@
               <a:graphicData uri="http://schemas.openxmlformats.org/drawingml/2006/picture">
                 <pic:pic xmlns:pic="http://schemas.openxmlformats.org/drawingml/2006/picture">
                   <pic:nvPicPr>
-                    <pic:cNvPr id="27" name="Image25" descr=""/>
+                    <pic:cNvPr id="28" name="Image25" descr=""/>
                     <pic:cNvPicPr>
                       <a:picLocks noChangeAspect="1" noChangeArrowheads="1"/>
                     </pic:cNvPicPr>
@@ -3836,7 +3838,7 @@
       <w:r>
         <w:rPr/>
         <w:drawing>
-          <wp:anchor behindDoc="0" distT="0" distB="0" distL="0" distR="0" simplePos="0" locked="0" layoutInCell="0" allowOverlap="1" relativeHeight="30">
+          <wp:anchor behindDoc="0" distT="0" distB="0" distL="0" distR="0" simplePos="0" locked="0" layoutInCell="0" allowOverlap="1" relativeHeight="69">
             <wp:simplePos x="0" y="0"/>
             <wp:positionH relativeFrom="column">
               <wp:align>center</wp:align>
@@ -3847,7 +3849,7 @@
             <wp:extent cx="5943600" cy="2834005"/>
             <wp:effectExtent l="0" t="0" r="0" b="0"/>
             <wp:wrapSquare wrapText="largest"/>
-            <wp:docPr id="28" name="Image26" descr=""/>
+            <wp:docPr id="29" name="Image26" descr=""/>
             <wp:cNvGraphicFramePr>
               <a:graphicFrameLocks xmlns:a="http://schemas.openxmlformats.org/drawingml/2006/main" noChangeAspect="1"/>
             </wp:cNvGraphicFramePr>
@@ -3855,7 +3857,7 @@
               <a:graphicData uri="http://schemas.openxmlformats.org/drawingml/2006/picture">
                 <pic:pic xmlns:pic="http://schemas.openxmlformats.org/drawingml/2006/picture">
                   <pic:nvPicPr>
-                    <pic:cNvPr id="28" name="Image26" descr=""/>
+                    <pic:cNvPr id="29" name="Image26" descr=""/>
                     <pic:cNvPicPr>
                       <a:picLocks noChangeAspect="1" noChangeArrowheads="1"/>
                     </pic:cNvPicPr>
@@ -3895,6 +3897,7 @@
       <w:pPr>
         <w:pStyle w:val="Heading2"/>
         <w:spacing w:before="40" w:after="283"/>
+        <w:ind w:left="0" w:hanging="0"/>
         <w:rPr/>
       </w:pPr>
       <w:r>
@@ -3980,7 +3983,7 @@
           <w:ilvl w:val="0"/>
           <w:numId w:val="0"/>
         </w:numPr>
-        <w:ind w:hanging="0"/>
+        <w:ind w:left="0" w:hanging="0"/>
         <w:rPr/>
       </w:pPr>
       <w:r>
@@ -3992,6 +3995,7 @@
       <w:pPr>
         <w:pStyle w:val="Heading2"/>
         <w:spacing w:before="40" w:after="283"/>
+        <w:ind w:left="0" w:hanging="0"/>
         <w:rPr/>
       </w:pPr>
       <w:r>
@@ -4011,6 +4015,7 @@
       <w:pPr>
         <w:pStyle w:val="Heading2"/>
         <w:spacing w:before="40" w:after="283"/>
+        <w:ind w:left="0" w:hanging="0"/>
         <w:rPr/>
       </w:pPr>
       <w:r>
@@ -4090,17 +4095,13 @@
       <w:pPr>
         <w:pStyle w:val="Heading2"/>
         <w:spacing w:before="40" w:after="283"/>
+        <w:ind w:left="0" w:hanging="0"/>
         <w:rPr>
           <w:rFonts w:ascii="Arial" w:hAnsi="Arial" w:cs="Arial"/>
         </w:rPr>
       </w:pPr>
       <w:r>
-        <w:rPr>
-          <w:rFonts w:cs="Tahoma" w:ascii="Tahoma" w:hAnsi="Tahoma"/>
-          <w:b/>
-          <w:sz w:val="24"/>
-          <w:szCs w:val="24"/>
-        </w:rPr>
+        <w:rPr/>
       </w:r>
     </w:p>
     <w:sectPr>
@@ -4139,7 +4140,7 @@
       <mc:AlternateContent>
         <mc:Choice Requires="wps">
           <w:drawing>
-            <wp:anchor behindDoc="1" distT="0" distB="0" distL="0" distR="0" simplePos="0" locked="0" layoutInCell="0" allowOverlap="1" relativeHeight="4">
+            <wp:anchor behindDoc="1" distT="635" distB="0" distL="635" distR="0" simplePos="0" locked="0" layoutInCell="0" allowOverlap="1" relativeHeight="42">
               <wp:simplePos x="0" y="0"/>
               <wp:positionH relativeFrom="column">
                 <wp:posOffset>-838200</wp:posOffset>
@@ -4150,7 +4151,7 @@
               <wp:extent cx="3762375" cy="1241425"/>
               <wp:effectExtent l="635" t="635" r="0" b="0"/>
               <wp:wrapNone/>
-              <wp:docPr id="30" name="Text Box 2"/>
+              <wp:docPr id="31" name="Text Box 2"/>
               <a:graphic xmlns:a="http://schemas.openxmlformats.org/drawingml/2006/main">
                 <a:graphicData uri="http://schemas.microsoft.com/office/word/2010/wordprocessingShape">
                   <wps:wsp>
@@ -4279,7 +4280,7 @@
           <w:pict>
             <v:rect id="shape_0" ID="Text Box 2" path="m0,0l-2147483645,0l-2147483645,-2147483646l0,-2147483646xe" stroked="f" o:allowincell="f" style="position:absolute;margin-left:-66pt;margin-top:24.95pt;width:296.2pt;height:97.7pt;mso-wrap-style:square;v-text-anchor:top">
               <v:fill o:detectmouseclick="t" on="false"/>
-              <v:stroke color="#3465a4" weight="9360" joinstyle="miter" endcap="flat"/>
+              <v:stroke color="#3465a4" weight="9360" joinstyle="round" endcap="flat"/>
               <v:textbox>
                 <w:txbxContent>
                   <w:p>
@@ -4436,7 +4437,7 @@
       <mc:AlternateContent>
         <mc:Choice Requires="wps">
           <w:drawing>
-            <wp:anchor behindDoc="1" distT="0" distB="5715" distL="0" distR="0" simplePos="0" locked="0" layoutInCell="0" allowOverlap="1" relativeHeight="3">
+            <wp:anchor behindDoc="1" distT="0" distB="0" distL="0" distR="0" simplePos="0" locked="0" layoutInCell="0" allowOverlap="1" relativeHeight="15">
               <wp:simplePos x="0" y="0"/>
               <wp:positionH relativeFrom="column">
                 <wp:posOffset>-914400</wp:posOffset>
@@ -4447,7 +4448,7 @@
               <wp:extent cx="7734300" cy="52070"/>
               <wp:effectExtent l="0" t="0" r="0" b="0"/>
               <wp:wrapNone/>
-              <wp:docPr id="29" name="Rectangle 10"/>
+              <wp:docPr id="30" name="Rectangle 10"/>
               <a:graphic xmlns:a="http://schemas.openxmlformats.org/drawingml/2006/main">
                 <a:graphicData uri="http://schemas.microsoft.com/office/word/2010/wordprocessingShape">
                   <wps:wsp>
@@ -6639,15 +6640,14 @@
     <w:qFormat/>
     <w:pPr>
       <w:widowControl/>
-      <w:kinsoku w:val="true"/>
-      <w:overflowPunct w:val="true"/>
-      <w:autoSpaceDE w:val="true"/>
+      <w:suppressAutoHyphens w:val="true"/>
+      <w:overflowPunct w:val="false"/>
       <w:bidi w:val="0"/>
       <w:spacing w:lineRule="auto" w:line="259" w:before="0" w:after="160"/>
       <w:jc w:val="left"/>
     </w:pPr>
     <w:rPr>
-      <w:rFonts w:ascii="Calibri" w:hAnsi="Calibri" w:eastAsia="Calibri"/>
+      <w:rFonts w:ascii="Calibri" w:hAnsi="Calibri" w:eastAsia="Calibri" w:cs="DejaVu Sans"/>
       <w:color w:val="auto"/>
       <w:kern w:val="0"/>
       <w:sz w:val="22"/>
@@ -6714,9 +6714,8 @@
         <w:ilvl w:val="2"/>
         <w:numId w:val="1"/>
       </w:numPr>
-      <w:kinsoku w:val="true"/>
-      <w:overflowPunct w:val="true"/>
-      <w:autoSpaceDE w:val="true"/>
+      <w:suppressAutoHyphens w:val="true"/>
+      <w:overflowPunct w:val="false"/>
       <w:bidi w:val="0"/>
       <w:spacing w:lineRule="auto" w:line="259" w:before="0" w:after="21"/>
       <w:ind w:left="0" w:right="133" w:hanging="0"/>
@@ -6770,9 +6769,8 @@
         <w:ilvl w:val="4"/>
         <w:numId w:val="1"/>
       </w:numPr>
-      <w:kinsoku w:val="true"/>
-      <w:overflowPunct w:val="true"/>
-      <w:autoSpaceDE w:val="true"/>
+      <w:suppressAutoHyphens w:val="true"/>
+      <w:overflowPunct w:val="false"/>
       <w:bidi w:val="0"/>
       <w:spacing w:lineRule="auto" w:line="259" w:before="0" w:after="21"/>
       <w:ind w:left="0" w:right="133" w:hanging="0"/>
@@ -7163,15 +7161,14 @@
     <w:qFormat/>
     <w:pPr>
       <w:widowControl/>
-      <w:kinsoku w:val="true"/>
-      <w:overflowPunct w:val="true"/>
-      <w:autoSpaceDE w:val="true"/>
+      <w:suppressAutoHyphens w:val="true"/>
+      <w:overflowPunct w:val="false"/>
       <w:bidi w:val="0"/>
       <w:spacing w:lineRule="auto" w:line="240" w:before="0" w:after="0"/>
       <w:jc w:val="left"/>
     </w:pPr>
     <w:rPr>
-      <w:rFonts w:eastAsia="Calibri" w:ascii="Calibri" w:hAnsi="Calibri"/>
+      <w:rFonts w:ascii="Calibri" w:hAnsi="Calibri" w:eastAsia="Calibri" w:cs="DejaVu Sans"/>
       <w:color w:val="auto"/>
       <w:kern w:val="0"/>
       <w:sz w:val="22"/>

</xml_diff>